<commit_message>
Alinha parecer à planilha consolidada e adiciona versão em PDF
Atualiza referências para a Planilha Consolidada (Anexo I), inclui seção
"10. Anexos" e nota de metodologia sobre a consolidação. Gera o parecer
também em PDF (5 páginas).

Co-Authored-By: Claude Opus 4.8 <noreply@anthropic.com>
Claude-Session: https://claude.ai/code/session_01CRt2TMM1MouBrhgQ5biwcN
</commit_message>
<xml_diff>
--- a/Auditoria_Reabilitacao_Inidoneidade/05_Entregaveis/Parecer_Tecnico_Complementar_JDS.docx
+++ b/Auditoria_Reabilitacao_Inidoneidade/05_Entregaveis/Parecer_Tecnico_Complementar_JDS.docx
@@ -908,6 +908,16 @@
           <w:sz w:val="19"/>
         </w:rPr>
         <w:t>Registra-se que a página institucional (jdseng.com.br) não pôde ser verificada de forma direta no ambiente de análise; para os itens que dependem do sítio eletrônico (17.x e 23.x), considerou-se exclusivamente a evidência documental juntada.</w:t>
+      </w:r>
+    </w:p>
+    <w:p>
+      <w:r>
+        <w:rPr>
+          <w:b w:val="0"/>
+          <w:i/>
+          <w:sz w:val="19"/>
+        </w:rPr>
+        <w:t>O resultado da reavaliação foi consolidado, questão a questão, na Planilha Consolidada das 113 Questões (Anexo I): as colunas Resposta, Avaliação e Evidência apresentam, respectivamente, o resultado final, a justificativa unificada (1ª análise e complementação) e os documentos de suporte de ambas as fases.</w:t>
       </w:r>
     </w:p>
     <w:p>
@@ -2760,7 +2770,7 @@
           <w:i w:val="0"/>
           <w:sz w:val="21"/>
         </w:rPr>
-        <w:t>Além das críticas, foram reavaliadas as demais pendências. Destacam-se as superações em governança e independência da instância de integridade (itens 4.2, 4.3, 5.1 e 2.3, com o Termo de Designação do Oficial de Compliance), em gestão de riscos (6.1 a 6.3.3), em diligências de terceiros (14.1.2, 14.1.3 e 15.2, com o novo Procedimento de Due Diligence e cláusulas-padrão) e em doações/patrocínios (8.1.5). Permanecem parcialmente atendidas questões que dependem de execução continuada (treinamentos 10.2–10.4; indicadores e relatórios de monitoramento 20.3.1–20.3.2; comunicações recorrentes 11.2.1) e não atendidas as que dependem de evidências ainda não juntadas, sobretudo o conteúdo do sítio institucional (23.2.1 a 23.2.5 e 23.3) e a responsabilização (24.2.1 e 24.2.2). O detalhamento consta da planilha reavaliada.</w:t>
+        <w:t>Além das críticas, foram reavaliadas as demais pendências. Destacam-se as superações em governança e independência da instância de integridade (itens 4.2, 4.3, 5.1 e 2.3, com o Termo de Designação do Oficial de Compliance), em gestão de riscos (6.1 a 6.3.3), em diligências de terceiros (14.1.2, 14.1.3 e 15.2, com o novo Procedimento de Due Diligence e cláusulas-padrão) e em doações/patrocínios (8.1.5). Permanecem parcialmente atendidas questões que dependem de execução continuada (treinamentos 10.2–10.4; indicadores e relatórios de monitoramento 20.3.1–20.3.2; comunicações recorrentes 11.2.1) e não atendidas as que dependem de evidências ainda não juntadas, sobretudo o conteúdo do sítio institucional (23.2.1 a 23.2.5 e 23.3) e a responsabilização (24.2.1 e 24.2.2). O detalhamento consta da Planilha Consolidada das 113 Questões (Anexo I).</w:t>
       </w:r>
     </w:p>
     <w:p>
@@ -2846,6 +2856,37 @@
           <w:i w:val="0"/>
           <w:sz w:val="21"/>
         </w:rPr>
+      </w:r>
+    </w:p>
+    <w:p>
+      <w:pPr>
+        <w:pStyle w:val="Heading1"/>
+      </w:pPr>
+      <w:r>
+        <w:rPr>
+          <w:color w:val="1F4E79"/>
+        </w:rPr>
+        <w:t>10. Anexos</w:t>
+      </w:r>
+    </w:p>
+    <w:p>
+      <w:r>
+        <w:rPr>
+          <w:b w:val="0"/>
+          <w:i w:val="0"/>
+          <w:sz w:val="20"/>
+        </w:rPr>
+        <w:t>Anexo I — Planilha Consolidada das 113 Questões (arquivo Planilha_JDS_Consolidada_113_Questoes.xlsx): resultado final consolidado, com Resposta, Avaliação e Evidência unificadas por questão.</w:t>
+      </w:r>
+    </w:p>
+    <w:p>
+      <w:r>
+        <w:rPr>
+          <w:b w:val="0"/>
+          <w:i w:val="0"/>
+          <w:sz w:val="20"/>
+        </w:rPr>
+        <w:t>Anexo II — Planilha detalhada da reavaliação (arquivo Planilha_JDS_Reavaliada_113_Questoes.xlsx): memória de cálculo, com as duas análises em colunas separadas.</w:t>
       </w:r>
     </w:p>
     <w:p>

</xml_diff>